<commit_message>
Dodanie pliku z dokumentacją
</commit_message>
<xml_diff>
--- a/Projekt dynamicznej strony HTML i CSS.docx
+++ b/Projekt dynamicznej strony HTML i CSS.docx
@@ -52,13 +52,21 @@
       <w:pPr>
         <w:pStyle w:val="Bezodstpw"/>
       </w:pPr>
+      <w:r>
+        <w:t>Stworzenie repozytorium na GitHub</w:t>
+      </w:r>
     </w:p>
     <w:p>
+      <w:pPr>
+        <w:pStyle w:val="Bezodstpw"/>
+      </w:pPr>
+    </w:p>
+    <w:p>
       <w:r>
         <w:drawing>
-          <wp:inline distT="0" distB="0" distL="0" distR="0" wp14:anchorId="2195A1D9" wp14:editId="0C9B8F5C">
-            <wp:extent cx="5731510" cy="2834005"/>
-            <wp:effectExtent l="0" t="0" r="2540" b="4445"/>
+          <wp:inline distT="0" distB="0" distL="0" distR="0" wp14:anchorId="2195A1D9" wp14:editId="6488B7AC">
+            <wp:extent cx="5130800" cy="2536978"/>
+            <wp:effectExtent l="0" t="0" r="0" b="0"/>
             <wp:docPr id="32992992" name="Obraz 1"/>
             <wp:cNvGraphicFramePr>
               <a:graphicFrameLocks xmlns:a="http://schemas.openxmlformats.org/drawingml/2006/main" noChangeAspect="1"/>
@@ -79,7 +87,7 @@
                   <pic:spPr>
                     <a:xfrm>
                       <a:off x="0" y="0"/>
-                      <a:ext cx="5731510" cy="2834005"/>
+                      <a:ext cx="5139628" cy="2541343"/>
                     </a:xfrm>
                     <a:prstGeom prst="rect">
                       <a:avLst/>
@@ -92,6 +100,67 @@
         </w:drawing>
       </w:r>
     </w:p>
+    <w:p>
+      <w:r>
+        <w:t xml:space="preserve">Założenie drugiego </w:t>
+      </w:r>
+      <w:proofErr w:type="spellStart"/>
+      <w:r>
+        <w:t>brancha</w:t>
+      </w:r>
+      <w:proofErr w:type="spellEnd"/>
+      <w:r>
+        <w:t xml:space="preserve"> </w:t>
+      </w:r>
+      <w:proofErr w:type="spellStart"/>
+      <w:r>
+        <w:t>develop</w:t>
+      </w:r>
+      <w:proofErr w:type="spellEnd"/>
+      <w:r>
+        <w:t xml:space="preserve"> – dodanie pliku README.md</w:t>
+      </w:r>
+    </w:p>
+    <w:p>
+      <w:r>
+        <w:drawing>
+          <wp:inline distT="0" distB="0" distL="0" distR="0" wp14:anchorId="5484BCE6" wp14:editId="34E544D3">
+            <wp:extent cx="5130800" cy="4004707"/>
+            <wp:effectExtent l="0" t="0" r="0" b="0"/>
+            <wp:docPr id="1240829561" name="Obraz 1"/>
+            <wp:cNvGraphicFramePr>
+              <a:graphicFrameLocks xmlns:a="http://schemas.openxmlformats.org/drawingml/2006/main" noChangeAspect="1"/>
+            </wp:cNvGraphicFramePr>
+            <a:graphic xmlns:a="http://schemas.openxmlformats.org/drawingml/2006/main">
+              <a:graphicData uri="http://schemas.openxmlformats.org/drawingml/2006/picture">
+                <pic:pic xmlns:pic="http://schemas.openxmlformats.org/drawingml/2006/picture">
+                  <pic:nvPicPr>
+                    <pic:cNvPr id="1240829561" name=""/>
+                    <pic:cNvPicPr/>
+                  </pic:nvPicPr>
+                  <pic:blipFill>
+                    <a:blip r:embed="rId5"/>
+                    <a:stretch>
+                      <a:fillRect/>
+                    </a:stretch>
+                  </pic:blipFill>
+                  <pic:spPr>
+                    <a:xfrm>
+                      <a:off x="0" y="0"/>
+                      <a:ext cx="5139032" cy="4011133"/>
+                    </a:xfrm>
+                    <a:prstGeom prst="rect">
+                      <a:avLst/>
+                    </a:prstGeom>
+                  </pic:spPr>
+                </pic:pic>
+              </a:graphicData>
+            </a:graphic>
+          </wp:inline>
+        </w:drawing>
+      </w:r>
+    </w:p>
+    <w:p/>
     <w:sectPr>
       <w:pgSz w:w="11906" w:h="16838"/>
       <w:pgMar w:top="1440" w:right="1440" w:bottom="1440" w:left="1440" w:header="708" w:footer="708" w:gutter="0"/>

</xml_diff>

<commit_message>
Dodanie styli do sekcji, grida, przycisku, hero
</commit_message>
<xml_diff>
--- a/Projekt dynamicznej strony HTML i CSS.docx
+++ b/Projekt dynamicznej strony HTML i CSS.docx
@@ -61,7 +61,15 @@
         <w:t xml:space="preserve">odniesienia </w:t>
       </w:r>
       <w:r>
-        <w:t>styli w kodzie html.</w:t>
+        <w:t xml:space="preserve">styli w kodzie </w:t>
+      </w:r>
+      <w:proofErr w:type="spellStart"/>
+      <w:r>
+        <w:t>html</w:t>
+      </w:r>
+      <w:proofErr w:type="spellEnd"/>
+      <w:r>
+        <w:t>.</w:t>
       </w:r>
       <w:r>
         <w:t xml:space="preserve"> </w:t>
@@ -174,7 +182,23 @@
     <w:p/>
     <w:p>
       <w:r>
-        <w:t>Założenie drugiego brancha develop – dodanie pliku README.md</w:t>
+        <w:t xml:space="preserve">Założenie drugiego </w:t>
+      </w:r>
+      <w:proofErr w:type="spellStart"/>
+      <w:r>
+        <w:t>brancha</w:t>
+      </w:r>
+      <w:proofErr w:type="spellEnd"/>
+      <w:r>
+        <w:t xml:space="preserve"> </w:t>
+      </w:r>
+      <w:proofErr w:type="spellStart"/>
+      <w:r>
+        <w:t>develop</w:t>
+      </w:r>
+      <w:proofErr w:type="spellEnd"/>
+      <w:r>
+        <w:t xml:space="preserve"> – dodanie pliku README.md</w:t>
       </w:r>
     </w:p>
     <w:p>
@@ -268,16 +292,16 @@
     <w:p>
       <w:r>
         <w:lastRenderedPageBreak/>
-        <w:t>Dodanie nagłówka strony, menu</w:t>
+        <w:t>Stworzenie struktury HTML i dodanie stylu reset</w:t>
       </w:r>
     </w:p>
     <w:p>
       <w:r>
         <w:drawing>
-          <wp:inline distT="0" distB="0" distL="0" distR="0" wp14:anchorId="169DA3A0" wp14:editId="34137B5D">
-            <wp:extent cx="5731510" cy="2096135"/>
+          <wp:inline distT="0" distB="0" distL="0" distR="0" wp14:anchorId="7954D372" wp14:editId="237C6739">
+            <wp:extent cx="5731510" cy="2936875"/>
             <wp:effectExtent l="0" t="0" r="2540" b="0"/>
-            <wp:docPr id="1570412780" name="Obraz 1"/>
+            <wp:docPr id="1273066426" name="Obraz 1"/>
             <wp:cNvGraphicFramePr>
               <a:graphicFrameLocks xmlns:a="http://schemas.openxmlformats.org/drawingml/2006/main" noChangeAspect="1"/>
             </wp:cNvGraphicFramePr>
@@ -285,7 +309,7 @@
               <a:graphicData uri="http://schemas.openxmlformats.org/drawingml/2006/picture">
                 <pic:pic xmlns:pic="http://schemas.openxmlformats.org/drawingml/2006/picture">
                   <pic:nvPicPr>
-                    <pic:cNvPr id="1570412780" name=""/>
+                    <pic:cNvPr id="1273066426" name=""/>
                     <pic:cNvPicPr/>
                   </pic:nvPicPr>
                   <pic:blipFill>
@@ -297,7 +321,7 @@
                   <pic:spPr>
                     <a:xfrm>
                       <a:off x="0" y="0"/>
-                      <a:ext cx="5731510" cy="2096135"/>
+                      <a:ext cx="5731510" cy="2936875"/>
                     </a:xfrm>
                     <a:prstGeom prst="rect">
                       <a:avLst/>
@@ -309,6 +333,292 @@
           </wp:inline>
         </w:drawing>
       </w:r>
+    </w:p>
+    <w:p/>
+    <w:p>
+      <w:r>
+        <w:t xml:space="preserve">Początkowe style dla </w:t>
+      </w:r>
+      <w:r>
+        <w:t>&lt;</w:t>
+      </w:r>
+      <w:r>
+        <w:t>body</w:t>
+      </w:r>
+      <w:r>
+        <w:t>&gt;</w:t>
+      </w:r>
+      <w:r>
+        <w:t xml:space="preserve"> i znacznika </w:t>
+      </w:r>
+      <w:r>
+        <w:t>&lt;</w:t>
+      </w:r>
+      <w:r>
+        <w:t>a</w:t>
+      </w:r>
+      <w:r>
+        <w:t>&gt;</w:t>
+      </w:r>
+      <w:r>
+        <w:drawing>
+          <wp:inline distT="0" distB="0" distL="0" distR="0" wp14:anchorId="26CA4DC2" wp14:editId="6F5B4C7A">
+            <wp:extent cx="5731510" cy="2513330"/>
+            <wp:effectExtent l="0" t="0" r="2540" b="1270"/>
+            <wp:docPr id="91192795" name="Obraz 1"/>
+            <wp:cNvGraphicFramePr>
+              <a:graphicFrameLocks xmlns:a="http://schemas.openxmlformats.org/drawingml/2006/main" noChangeAspect="1"/>
+            </wp:cNvGraphicFramePr>
+            <a:graphic xmlns:a="http://schemas.openxmlformats.org/drawingml/2006/main">
+              <a:graphicData uri="http://schemas.openxmlformats.org/drawingml/2006/picture">
+                <pic:pic xmlns:pic="http://schemas.openxmlformats.org/drawingml/2006/picture">
+                  <pic:nvPicPr>
+                    <pic:cNvPr id="91192795" name=""/>
+                    <pic:cNvPicPr/>
+                  </pic:nvPicPr>
+                  <pic:blipFill>
+                    <a:blip r:embed="rId9"/>
+                    <a:stretch>
+                      <a:fillRect/>
+                    </a:stretch>
+                  </pic:blipFill>
+                  <pic:spPr>
+                    <a:xfrm>
+                      <a:off x="0" y="0"/>
+                      <a:ext cx="5731510" cy="2513330"/>
+                    </a:xfrm>
+                    <a:prstGeom prst="rect">
+                      <a:avLst/>
+                    </a:prstGeom>
+                  </pic:spPr>
+                </pic:pic>
+              </a:graphicData>
+            </a:graphic>
+          </wp:inline>
+        </w:drawing>
+      </w:r>
+    </w:p>
+    <w:p>
+      <w:r>
+        <w:br w:type="page"/>
+      </w:r>
+    </w:p>
+    <w:p/>
+    <w:p>
+      <w:pPr>
+        <w:tabs>
+          <w:tab w:val="left" w:pos="2480"/>
+        </w:tabs>
+      </w:pPr>
+      <w:r>
+        <w:t>Dodanie styli do sekcji:</w:t>
+      </w:r>
+    </w:p>
+    <w:p>
+      <w:pPr>
+        <w:tabs>
+          <w:tab w:val="left" w:pos="2480"/>
+        </w:tabs>
+      </w:pPr>
+      <w:r>
+        <w:drawing>
+          <wp:inline distT="0" distB="0" distL="0" distR="0" wp14:anchorId="33CFA672" wp14:editId="04A7539F">
+            <wp:extent cx="5731510" cy="3347085"/>
+            <wp:effectExtent l="0" t="0" r="2540" b="5715"/>
+            <wp:docPr id="181882644" name="Obraz 1"/>
+            <wp:cNvGraphicFramePr>
+              <a:graphicFrameLocks xmlns:a="http://schemas.openxmlformats.org/drawingml/2006/main" noChangeAspect="1"/>
+            </wp:cNvGraphicFramePr>
+            <a:graphic xmlns:a="http://schemas.openxmlformats.org/drawingml/2006/main">
+              <a:graphicData uri="http://schemas.openxmlformats.org/drawingml/2006/picture">
+                <pic:pic xmlns:pic="http://schemas.openxmlformats.org/drawingml/2006/picture">
+                  <pic:nvPicPr>
+                    <pic:cNvPr id="181882644" name=""/>
+                    <pic:cNvPicPr/>
+                  </pic:nvPicPr>
+                  <pic:blipFill>
+                    <a:blip r:embed="rId10"/>
+                    <a:stretch>
+                      <a:fillRect/>
+                    </a:stretch>
+                  </pic:blipFill>
+                  <pic:spPr>
+                    <a:xfrm>
+                      <a:off x="0" y="0"/>
+                      <a:ext cx="5731510" cy="3347085"/>
+                    </a:xfrm>
+                    <a:prstGeom prst="rect">
+                      <a:avLst/>
+                    </a:prstGeom>
+                  </pic:spPr>
+                </pic:pic>
+              </a:graphicData>
+            </a:graphic>
+          </wp:inline>
+        </w:drawing>
+      </w:r>
+    </w:p>
+    <w:p>
+      <w:pPr>
+        <w:tabs>
+          <w:tab w:val="left" w:pos="2480"/>
+        </w:tabs>
+      </w:pPr>
+    </w:p>
+    <w:p>
+      <w:pPr>
+        <w:tabs>
+          <w:tab w:val="left" w:pos="2480"/>
+        </w:tabs>
+      </w:pPr>
+      <w:r>
+        <w:t>Style dla hero i przycisku</w:t>
+      </w:r>
+    </w:p>
+    <w:p>
+      <w:pPr>
+        <w:tabs>
+          <w:tab w:val="left" w:pos="2480"/>
+        </w:tabs>
+      </w:pPr>
+      <w:r>
+        <w:drawing>
+          <wp:inline distT="0" distB="0" distL="0" distR="0" wp14:anchorId="1D8D4C5E" wp14:editId="50B77116">
+            <wp:extent cx="3035456" cy="2190863"/>
+            <wp:effectExtent l="0" t="0" r="0" b="0"/>
+            <wp:docPr id="2117872671" name="Obraz 1"/>
+            <wp:cNvGraphicFramePr>
+              <a:graphicFrameLocks xmlns:a="http://schemas.openxmlformats.org/drawingml/2006/main" noChangeAspect="1"/>
+            </wp:cNvGraphicFramePr>
+            <a:graphic xmlns:a="http://schemas.openxmlformats.org/drawingml/2006/main">
+              <a:graphicData uri="http://schemas.openxmlformats.org/drawingml/2006/picture">
+                <pic:pic xmlns:pic="http://schemas.openxmlformats.org/drawingml/2006/picture">
+                  <pic:nvPicPr>
+                    <pic:cNvPr id="2117872671" name=""/>
+                    <pic:cNvPicPr/>
+                  </pic:nvPicPr>
+                  <pic:blipFill>
+                    <a:blip r:embed="rId11"/>
+                    <a:stretch>
+                      <a:fillRect/>
+                    </a:stretch>
+                  </pic:blipFill>
+                  <pic:spPr>
+                    <a:xfrm>
+                      <a:off x="0" y="0"/>
+                      <a:ext cx="3035456" cy="2190863"/>
+                    </a:xfrm>
+                    <a:prstGeom prst="rect">
+                      <a:avLst/>
+                    </a:prstGeom>
+                  </pic:spPr>
+                </pic:pic>
+              </a:graphicData>
+            </a:graphic>
+          </wp:inline>
+        </w:drawing>
+      </w:r>
+      <w:r>
+        <w:rPr>
+          <w:noProof/>
+        </w:rPr>
+        <w:t xml:space="preserve"> </w:t>
+      </w:r>
+      <w:r>
+        <w:drawing>
+          <wp:inline distT="0" distB="0" distL="0" distR="0" wp14:anchorId="1B6638C2" wp14:editId="75969CEE">
+            <wp:extent cx="2203450" cy="2203450"/>
+            <wp:effectExtent l="0" t="0" r="6350" b="6350"/>
+            <wp:docPr id="1322933354" name="Obraz 1"/>
+            <wp:cNvGraphicFramePr>
+              <a:graphicFrameLocks xmlns:a="http://schemas.openxmlformats.org/drawingml/2006/main" noChangeAspect="1"/>
+            </wp:cNvGraphicFramePr>
+            <a:graphic xmlns:a="http://schemas.openxmlformats.org/drawingml/2006/main">
+              <a:graphicData uri="http://schemas.openxmlformats.org/drawingml/2006/picture">
+                <pic:pic xmlns:pic="http://schemas.openxmlformats.org/drawingml/2006/picture">
+                  <pic:nvPicPr>
+                    <pic:cNvPr id="1322933354" name=""/>
+                    <pic:cNvPicPr/>
+                  </pic:nvPicPr>
+                  <pic:blipFill>
+                    <a:blip r:embed="rId12"/>
+                    <a:stretch>
+                      <a:fillRect/>
+                    </a:stretch>
+                  </pic:blipFill>
+                  <pic:spPr>
+                    <a:xfrm>
+                      <a:off x="0" y="0"/>
+                      <a:ext cx="2203562" cy="2203562"/>
+                    </a:xfrm>
+                    <a:prstGeom prst="rect">
+                      <a:avLst/>
+                    </a:prstGeom>
+                  </pic:spPr>
+                </pic:pic>
+              </a:graphicData>
+            </a:graphic>
+          </wp:inline>
+        </w:drawing>
+      </w:r>
+    </w:p>
+    <w:p>
+      <w:pPr>
+        <w:tabs>
+          <w:tab w:val="left" w:pos="2480"/>
+        </w:tabs>
+      </w:pPr>
+      <w:r>
+        <w:drawing>
+          <wp:inline distT="0" distB="0" distL="0" distR="0" wp14:anchorId="417343D8" wp14:editId="2C799D75">
+            <wp:extent cx="5731510" cy="1637030"/>
+            <wp:effectExtent l="0" t="0" r="2540" b="1270"/>
+            <wp:docPr id="514613563" name="Obraz 1"/>
+            <wp:cNvGraphicFramePr>
+              <a:graphicFrameLocks xmlns:a="http://schemas.openxmlformats.org/drawingml/2006/main" noChangeAspect="1"/>
+            </wp:cNvGraphicFramePr>
+            <a:graphic xmlns:a="http://schemas.openxmlformats.org/drawingml/2006/main">
+              <a:graphicData uri="http://schemas.openxmlformats.org/drawingml/2006/picture">
+                <pic:pic xmlns:pic="http://schemas.openxmlformats.org/drawingml/2006/picture">
+                  <pic:nvPicPr>
+                    <pic:cNvPr id="514613563" name=""/>
+                    <pic:cNvPicPr/>
+                  </pic:nvPicPr>
+                  <pic:blipFill>
+                    <a:blip r:embed="rId13"/>
+                    <a:stretch>
+                      <a:fillRect/>
+                    </a:stretch>
+                  </pic:blipFill>
+                  <pic:spPr>
+                    <a:xfrm>
+                      <a:off x="0" y="0"/>
+                      <a:ext cx="5731510" cy="1637030"/>
+                    </a:xfrm>
+                    <a:prstGeom prst="rect">
+                      <a:avLst/>
+                    </a:prstGeom>
+                  </pic:spPr>
+                </pic:pic>
+              </a:graphicData>
+            </a:graphic>
+          </wp:inline>
+        </w:drawing>
+      </w:r>
+    </w:p>
+    <w:p>
+      <w:pPr>
+        <w:tabs>
+          <w:tab w:val="left" w:pos="2480"/>
+        </w:tabs>
+      </w:pPr>
+    </w:p>
+    <w:p>
+      <w:pPr>
+        <w:tabs>
+          <w:tab w:val="left" w:pos="2480"/>
+        </w:tabs>
+      </w:pPr>
     </w:p>
     <w:sectPr>
       <w:pgSz w:w="11906" w:h="16838"/>

</xml_diff>

<commit_message>
.dodanie media query dla urządzeń mobilnych
</commit_message>
<xml_diff>
--- a/Projekt dynamicznej strony HTML i CSS.docx
+++ b/Projekt dynamicznej strony HTML i CSS.docx
@@ -61,15 +61,7 @@
         <w:t xml:space="preserve">odniesienia </w:t>
       </w:r>
       <w:r>
-        <w:t xml:space="preserve">styli w kodzie </w:t>
-      </w:r>
-      <w:proofErr w:type="spellStart"/>
-      <w:r>
-        <w:t>html</w:t>
-      </w:r>
-      <w:proofErr w:type="spellEnd"/>
-      <w:r>
-        <w:t>.</w:t>
+        <w:t>styli w kodzie html.</w:t>
       </w:r>
       <w:r>
         <w:t xml:space="preserve"> </w:t>
@@ -182,23 +174,7 @@
     <w:p/>
     <w:p>
       <w:r>
-        <w:t xml:space="preserve">Założenie drugiego </w:t>
-      </w:r>
-      <w:proofErr w:type="spellStart"/>
-      <w:r>
-        <w:t>brancha</w:t>
-      </w:r>
-      <w:proofErr w:type="spellEnd"/>
-      <w:r>
-        <w:t xml:space="preserve"> </w:t>
-      </w:r>
-      <w:proofErr w:type="spellStart"/>
-      <w:r>
-        <w:t>develop</w:t>
-      </w:r>
-      <w:proofErr w:type="spellEnd"/>
-      <w:r>
-        <w:t xml:space="preserve"> – dodanie pliku README.md</w:t>
+        <w:t>Założenie drugiego brancha develop – dodanie pliku README.md</w:t>
       </w:r>
     </w:p>
     <w:p>
@@ -621,15 +597,7 @@
       </w:pPr>
       <w:r>
         <w:lastRenderedPageBreak/>
-        <w:t xml:space="preserve">Dodanie efektu </w:t>
-      </w:r>
-      <w:proofErr w:type="spellStart"/>
-      <w:r>
-        <w:t>hover</w:t>
-      </w:r>
-      <w:proofErr w:type="spellEnd"/>
-      <w:r>
-        <w:t xml:space="preserve"> do przycisków w menu:</w:t>
+        <w:t>Dodanie efektu hover do przycisków w menu:</w:t>
       </w:r>
     </w:p>
     <w:p>
@@ -689,6 +657,126 @@
           <w:tab w:val="left" w:pos="2480"/>
         </w:tabs>
       </w:pPr>
+      <w:r>
+        <w:t>Efekt hover i transition</w:t>
+      </w:r>
+    </w:p>
+    <w:p>
+      <w:pPr>
+        <w:tabs>
+          <w:tab w:val="left" w:pos="2480"/>
+        </w:tabs>
+      </w:pPr>
+      <w:r>
+        <w:drawing>
+          <wp:inline distT="0" distB="0" distL="0" distR="0" wp14:anchorId="46683FAE" wp14:editId="285FDAD7">
+            <wp:extent cx="3581584" cy="2438525"/>
+            <wp:effectExtent l="0" t="0" r="0" b="0"/>
+            <wp:docPr id="2065745303" name="Obraz 1"/>
+            <wp:cNvGraphicFramePr>
+              <a:graphicFrameLocks xmlns:a="http://schemas.openxmlformats.org/drawingml/2006/main" noChangeAspect="1"/>
+            </wp:cNvGraphicFramePr>
+            <a:graphic xmlns:a="http://schemas.openxmlformats.org/drawingml/2006/main">
+              <a:graphicData uri="http://schemas.openxmlformats.org/drawingml/2006/picture">
+                <pic:pic xmlns:pic="http://schemas.openxmlformats.org/drawingml/2006/picture">
+                  <pic:nvPicPr>
+                    <pic:cNvPr id="2065745303" name=""/>
+                    <pic:cNvPicPr/>
+                  </pic:nvPicPr>
+                  <pic:blipFill>
+                    <a:blip r:embed="rId16"/>
+                    <a:stretch>
+                      <a:fillRect/>
+                    </a:stretch>
+                  </pic:blipFill>
+                  <pic:spPr>
+                    <a:xfrm>
+                      <a:off x="0" y="0"/>
+                      <a:ext cx="3581584" cy="2438525"/>
+                    </a:xfrm>
+                    <a:prstGeom prst="rect">
+                      <a:avLst/>
+                    </a:prstGeom>
+                  </pic:spPr>
+                </pic:pic>
+              </a:graphicData>
+            </a:graphic>
+          </wp:inline>
+        </w:drawing>
+      </w:r>
+    </w:p>
+    <w:p>
+      <w:r>
+        <w:br w:type="page"/>
+      </w:r>
+    </w:p>
+    <w:p>
+      <w:pPr>
+        <w:tabs>
+          <w:tab w:val="left" w:pos="2480"/>
+        </w:tabs>
+      </w:pPr>
+    </w:p>
+    <w:p>
+      <w:pPr>
+        <w:tabs>
+          <w:tab w:val="left" w:pos="2480"/>
+        </w:tabs>
+      </w:pPr>
+    </w:p>
+    <w:p>
+      <w:pPr>
+        <w:tabs>
+          <w:tab w:val="left" w:pos="2480"/>
+        </w:tabs>
+      </w:pPr>
+      <w:r>
+        <w:t>Dodanie media:</w:t>
+      </w:r>
+    </w:p>
+    <w:p>
+      <w:pPr>
+        <w:tabs>
+          <w:tab w:val="left" w:pos="2480"/>
+        </w:tabs>
+      </w:pPr>
+      <w:r>
+        <w:drawing>
+          <wp:inline distT="0" distB="0" distL="0" distR="0" wp14:anchorId="593B5348" wp14:editId="3C9E30B5">
+            <wp:extent cx="5731510" cy="3541395"/>
+            <wp:effectExtent l="0" t="0" r="2540" b="1905"/>
+            <wp:docPr id="979714041" name="Obraz 1"/>
+            <wp:cNvGraphicFramePr>
+              <a:graphicFrameLocks xmlns:a="http://schemas.openxmlformats.org/drawingml/2006/main" noChangeAspect="1"/>
+            </wp:cNvGraphicFramePr>
+            <a:graphic xmlns:a="http://schemas.openxmlformats.org/drawingml/2006/main">
+              <a:graphicData uri="http://schemas.openxmlformats.org/drawingml/2006/picture">
+                <pic:pic xmlns:pic="http://schemas.openxmlformats.org/drawingml/2006/picture">
+                  <pic:nvPicPr>
+                    <pic:cNvPr id="979714041" name=""/>
+                    <pic:cNvPicPr/>
+                  </pic:nvPicPr>
+                  <pic:blipFill>
+                    <a:blip r:embed="rId17"/>
+                    <a:stretch>
+                      <a:fillRect/>
+                    </a:stretch>
+                  </pic:blipFill>
+                  <pic:spPr>
+                    <a:xfrm>
+                      <a:off x="0" y="0"/>
+                      <a:ext cx="5731510" cy="3541395"/>
+                    </a:xfrm>
+                    <a:prstGeom prst="rect">
+                      <a:avLst/>
+                    </a:prstGeom>
+                  </pic:spPr>
+                </pic:pic>
+              </a:graphicData>
+            </a:graphic>
+          </wp:inline>
+        </w:drawing>
+      </w:r>
     </w:p>
     <w:sectPr>
       <w:pgSz w:w="11906" w:h="16838"/>

</xml_diff>